<commit_message>
Lito 40 dias: revisão Parte 4
Co-Authored-By: Claude Opus 5.5 <noreply@anthropic.com>
Claude-Session: https://claude.ai/code/session_01MJjUEEZrxQDEUifKK2vj9g
</commit_message>
<xml_diff>
--- a/roteiros/lito-sousa-morte/LitoSousa40_Parte4.docx
+++ b/roteiros/lito-sousa-morte/LitoSousa40_Parte4.docx
@@ -47,7 +47,7 @@
         <w:rPr>
           <w:color w:val="000000"/>
         </w:rPr>
-        <w:t>Ela explicou que o dinheiro ia ajudar a pagar o tratamento do marido. Que preferia fazer isso a pedir doações, organizar rifas ou abrir campanhas na internet. Diante da nova realidade da família, o carro tinha deixado de ser prioridade.</w:t>
+        <w:t>Ela explicou que o dinheiro ia ajudar a pagar o tratamento do marido. Que preferia fazer isso a recorrer a rifas ou campanhas. Diante da nova realidade da família, o carro tinha deixado de ser prioridade.</w:t>
       </w:r>
     </w:p>
     <w:p>
@@ -79,7 +79,7 @@
         <w:rPr>
           <w:color w:val="C00000"/>
         </w:rPr>
-        <w:t>E o que essa parte da internet fez com aquele anúncio é uma das coisas mais sujas dessa história inteira. Porque, em vez de ajudar, muita gente resolveu vasculhar o bolso de uma família que estava perdendo tudo.</w:t>
+        <w:t>E o que essa parte da internet fez com aquele anúncio é uma das coisas mais sujas dessa história inteira. Porque, em vez de ajudar, muita gente resolveu vasculhar o bolso de uma família em desespero.</w:t>
       </w:r>
     </w:p>
     <w:p>
@@ -103,7 +103,7 @@
         <w:rPr>
           <w:color w:val="000000"/>
         </w:rPr>
-        <w:t>Ninguém mostrou o relógio. Ninguém mostrou uma foto. Mas os comentários se multiplicaram mesmo assim.</w:t>
+        <w:t>Nenhuma foto do tal relógio apareceu. Mesmo assim, os comentários se multiplicaram.</w:t>
       </w:r>
     </w:p>
     <w:p>
@@ -111,7 +111,7 @@
         <w:rPr>
           <w:color w:val="000000"/>
         </w:rPr>
-        <w:t>Diziam que a família tinha dinheiro de sobra. Que vender o carro era encenação. Que, com tanto dinheiro, tudo ficava mais fácil.</w:t>
+        <w:t>Diziam que a família tinha dinheiro de sobra. Que, com tanto dinheiro, tudo ficava mais fácil.</w:t>
       </w:r>
     </w:p>
     <w:p>
@@ -455,7 +455,7 @@
         <w:rPr>
           <w:color w:val="1F4EB4"/>
         </w:rPr>
-        <w:t>E, no fim, disse a frase que derrubou a esperança de milhões de pessoas.</w:t>
+        <w:t>E, no fim, disse a frase que derrubou a esperança de muita gente.</w:t>
       </w:r>
     </w:p>
     <w:p>
@@ -623,7 +623,7 @@
         <w:rPr>
           <w:color w:val="C00000"/>
         </w:rPr>
-        <w:t>Três dias depois daquele vídeo feito por uma máquina, o perfil de Lito publicou outro. Dessa vez, quem falava era Mila. E bastou a primeira frase para milhões de pessoas entenderem o que tinha acontecido.</w:t>
+        <w:t>Três dias depois daquele vídeo feito por uma máquina, o perfil de Lito publicou outro. Dessa vez, quem falava era Mila. E o Brasil entendeu na hora o que tinha acontecido.</w:t>
       </w:r>
     </w:p>
     <w:sectPr>

</xml_diff>